<commit_message>
[ADD][PaymentsService]: add api GET/api/Payments/receipt/{orderCode}
</commit_message>
<xml_diff>
--- a/AMMS.API/Templates/HopDongTemplate.docx
+++ b/AMMS.API/Templates/HopDongTemplate.docx
@@ -384,92 +384,122 @@
     </w:p>
     <w:tbl>
       <w:tblPr>
-        <w:tblpPr w:leftFromText="180" w:rightFromText="180" w:vertAnchor="text" w:tblpXSpec="center" w:tblpY="1"/>
-        <w:tblOverlap w:val="never"/>
+        <w:tblStyle w:val="TableGrid"/>
         <w:tblW w:w="0" w:type="auto"/>
-        <w:tblCellSpacing w:w="15" w:type="dxa"/>
-        <w:tblLayout w:type="fixed"/>
-        <w:tblCellMar>
-          <w:top w:w="15" w:type="dxa"/>
-          <w:left w:w="15" w:type="dxa"/>
-          <w:bottom w:w="15" w:type="dxa"/>
-          <w:right w:w="15" w:type="dxa"/>
-        </w:tblCellMar>
+        <w:tblBorders>
+          <w:top w:val="none" w:sz="0" w:space="0" w:color="auto"/>
+          <w:left w:val="none" w:sz="0" w:space="0" w:color="auto"/>
+          <w:bottom w:val="none" w:sz="0" w:space="0" w:color="auto"/>
+          <w:right w:val="none" w:sz="0" w:space="0" w:color="auto"/>
+          <w:insideH w:val="none" w:sz="0" w:space="0" w:color="auto"/>
+          <w:insideV w:val="none" w:sz="0" w:space="0" w:color="auto"/>
+        </w:tblBorders>
         <w:tblLook w:val="04A0" w:firstRow="1" w:lastRow="0" w:firstColumn="1" w:lastColumn="0" w:noHBand="0" w:noVBand="1"/>
       </w:tblPr>
       <w:tblGrid>
-        <w:gridCol w:w="802"/>
-        <w:gridCol w:w="4140"/>
-        <w:gridCol w:w="2528"/>
+        <w:gridCol w:w="4509"/>
+        <w:gridCol w:w="4510"/>
       </w:tblGrid>
       <w:tr>
-        <w:trPr>
-          <w:tblHeader/>
-          <w:tblCellSpacing w:w="15" w:type="dxa"/>
-        </w:trPr>
         <w:tc>
           <w:tcPr>
-            <w:tcW w:w="757" w:type="dxa"/>
-            <w:tcBorders>
-              <w:top w:val="single" w:sz="6" w:space="0" w:color="auto"/>
-              <w:left w:val="single" w:sz="6" w:space="0" w:color="auto"/>
-              <w:bottom w:val="single" w:sz="6" w:space="0" w:color="auto"/>
-              <w:right w:val="single" w:sz="6" w:space="0" w:color="auto"/>
-            </w:tcBorders>
-            <w:vAlign w:val="center"/>
-            <w:hideMark/>
+            <w:tcW w:w="4509" w:type="dxa"/>
           </w:tcPr>
           <w:p>
             <w:pPr>
-              <w:jc w:val="center"/>
+              <w:pStyle w:val="ListParagraph"/>
+              <w:numPr>
+                <w:ilvl w:val="0"/>
+                <w:numId w:val="11"/>
+              </w:numPr>
+              <w:jc w:val="both"/>
             </w:pPr>
             <w:r>
               <w:rPr>
                 <w:b/>
               </w:rPr>
-              <w:t>STT</w:t>
+              <w:t>Tên sản phẩm</w:t>
             </w:r>
           </w:p>
         </w:tc>
         <w:tc>
           <w:tcPr>
-            <w:tcW w:w="4110" w:type="dxa"/>
-            <w:tcBorders>
-              <w:top w:val="single" w:sz="6" w:space="0" w:color="auto"/>
-              <w:left w:val="single" w:sz="6" w:space="0" w:color="auto"/>
-              <w:bottom w:val="single" w:sz="6" w:space="0" w:color="auto"/>
-              <w:right w:val="single" w:sz="6" w:space="0" w:color="auto"/>
-            </w:tcBorders>
-            <w:vAlign w:val="center"/>
-            <w:hideMark/>
+            <w:tcW w:w="4510" w:type="dxa"/>
           </w:tcPr>
           <w:p>
             <w:pPr>
-              <w:jc w:val="center"/>
+              <w:ind w:left="360"/>
+              <w:jc w:val="both"/>
+              <w:rPr>
+                <w:bCs w:val="0"/>
+              </w:rPr>
+            </w:pPr>
+            <w:r>
+              <w:rPr>
+                <w:bCs w:val="0"/>
+              </w:rPr>
+              <w:t>{{PRODUCT_NAME}}</w:t>
+            </w:r>
+          </w:p>
+        </w:tc>
+      </w:tr>
+      <w:tr>
+        <w:tc>
+          <w:tcPr>
+            <w:tcW w:w="4509" w:type="dxa"/>
+          </w:tcPr>
+          <w:p>
+            <w:pPr>
+              <w:pStyle w:val="ListParagraph"/>
+              <w:numPr>
+                <w:ilvl w:val="0"/>
+                <w:numId w:val="11"/>
+              </w:numPr>
+              <w:jc w:val="both"/>
             </w:pPr>
             <w:r>
               <w:rPr>
                 <w:b/>
+                <w:bCs w:val="0"/>
               </w:rPr>
-              <w:t>Tên sản phẩm &amp; Quy cách</w:t>
+              <w:t>Quy cách</w:t>
             </w:r>
           </w:p>
         </w:tc>
         <w:tc>
           <w:tcPr>
-            <w:tcW w:w="2483" w:type="dxa"/>
-            <w:tcBorders>
-              <w:top w:val="single" w:sz="6" w:space="0" w:color="auto"/>
-              <w:left w:val="single" w:sz="6" w:space="0" w:color="auto"/>
-              <w:bottom w:val="single" w:sz="6" w:space="0" w:color="auto"/>
-              <w:right w:val="single" w:sz="6" w:space="0" w:color="auto"/>
-            </w:tcBorders>
-            <w:vAlign w:val="center"/>
-            <w:hideMark/>
+            <w:tcW w:w="4510" w:type="dxa"/>
           </w:tcPr>
           <w:p>
             <w:pPr>
-              <w:jc w:val="center"/>
+              <w:ind w:left="360"/>
+              <w:jc w:val="both"/>
+              <w:rPr>
+                <w:bCs w:val="0"/>
+              </w:rPr>
+            </w:pPr>
+            <w:r>
+              <w:rPr>
+                <w:bCs w:val="0"/>
+              </w:rPr>
+              <w:t>{{PRODUCT_SPEC}}</w:t>
+            </w:r>
+          </w:p>
+        </w:tc>
+      </w:tr>
+      <w:tr>
+        <w:tc>
+          <w:tcPr>
+            <w:tcW w:w="4509" w:type="dxa"/>
+          </w:tcPr>
+          <w:p>
+            <w:pPr>
+              <w:pStyle w:val="ListParagraph"/>
+              <w:numPr>
+                <w:ilvl w:val="0"/>
+                <w:numId w:val="11"/>
+              </w:numPr>
+              <w:jc w:val="both"/>
             </w:pPr>
             <w:r>
               <w:rPr>
@@ -479,142 +509,41 @@
             </w:r>
           </w:p>
         </w:tc>
-      </w:tr>
-      <w:tr>
-        <w:trPr>
-          <w:tblCellSpacing w:w="15" w:type="dxa"/>
-        </w:trPr>
         <w:tc>
           <w:tcPr>
-            <w:tcW w:w="757" w:type="dxa"/>
-            <w:tcBorders>
-              <w:top w:val="single" w:sz="6" w:space="0" w:color="auto"/>
-              <w:left w:val="single" w:sz="6" w:space="0" w:color="auto"/>
-              <w:bottom w:val="single" w:sz="6" w:space="0" w:color="auto"/>
-              <w:right w:val="single" w:sz="6" w:space="0" w:color="auto"/>
-            </w:tcBorders>
-            <w:vAlign w:val="center"/>
-            <w:hideMark/>
+            <w:tcW w:w="4510" w:type="dxa"/>
           </w:tcPr>
           <w:p>
             <w:pPr>
-              <w:jc w:val="center"/>
-            </w:pPr>
-            <w:r>
-              <w:t>1</w:t>
-            </w:r>
-          </w:p>
-        </w:tc>
-        <w:tc>
-          <w:tcPr>
-            <w:tcW w:w="4110" w:type="dxa"/>
-            <w:tcBorders>
-              <w:top w:val="single" w:sz="6" w:space="0" w:color="auto"/>
-              <w:left w:val="single" w:sz="6" w:space="0" w:color="auto"/>
-              <w:bottom w:val="single" w:sz="6" w:space="0" w:color="auto"/>
-              <w:right w:val="single" w:sz="6" w:space="0" w:color="auto"/>
-            </w:tcBorders>
-            <w:vAlign w:val="center"/>
-            <w:hideMark/>
-          </w:tcPr>
-          <w:p>
-            <w:pPr>
-              <w:rPr>
-                <w:b/>
-                <w:bCs w:val="0"/>
-              </w:rPr>
-            </w:pPr>
-            <w:r>
-              <w:rPr>
-                <w:b/>
-                <w:bCs w:val="0"/>
-              </w:rPr>
-              <w:t>Tên SP:</w:t>
-            </w:r>
-            <w:r>
-              <w:rPr>
-                <w:b/>
-                <w:bCs w:val="0"/>
-              </w:rPr>
-              <w:t xml:space="preserve"> </w:t>
-            </w:r>
-            <w:r>
-              <w:rPr>
-                <w:bCs w:val="0"/>
-              </w:rPr>
-              <w:t>{{PRODUCT_NAME}}</w:t>
-            </w:r>
-          </w:p>
-          <w:p>
-            <w:pPr>
-              <w:rPr>
-                <w:b/>
-                <w:bCs w:val="0"/>
-              </w:rPr>
-            </w:pPr>
-            <w:r>
-              <w:rPr>
-                <w:b/>
-                <w:bCs w:val="0"/>
-              </w:rPr>
-              <w:t xml:space="preserve">Quy cách: </w:t>
-            </w:r>
-            <w:r>
-              <w:rPr>
-                <w:bCs w:val="0"/>
-              </w:rPr>
-              <w:t>{{</w:t>
-            </w:r>
-            <w:r>
-              <w:rPr>
-                <w:bCs w:val="0"/>
-              </w:rPr>
-              <w:t>PRODUCT_SPEC</w:t>
-            </w:r>
-            <w:r>
-              <w:rPr>
-                <w:bCs w:val="0"/>
-              </w:rPr>
-              <w:t>}}</w:t>
-            </w:r>
-          </w:p>
-          <w:p>
-            <w:pPr>
+              <w:ind w:left="360"/>
               <w:jc w:val="both"/>
-            </w:pPr>
-          </w:p>
-        </w:tc>
-        <w:tc>
-          <w:tcPr>
-            <w:tcW w:w="2483" w:type="dxa"/>
-            <w:tcBorders>
-              <w:top w:val="single" w:sz="6" w:space="0" w:color="auto"/>
-              <w:left w:val="single" w:sz="6" w:space="0" w:color="auto"/>
-              <w:bottom w:val="single" w:sz="6" w:space="0" w:color="auto"/>
-              <w:right w:val="single" w:sz="6" w:space="0" w:color="auto"/>
-            </w:tcBorders>
-            <w:vAlign w:val="center"/>
-            <w:hideMark/>
-          </w:tcPr>
-          <w:p>
-            <w:pPr>
-              <w:jc w:val="center"/>
             </w:pPr>
             <w:r>
               <w:t>{{QUANTITY}}</w:t>
             </w:r>
           </w:p>
+          <w:p>
+            <w:pPr>
+              <w:ind w:left="360"/>
+              <w:jc w:val="both"/>
+              <w:rPr>
+                <w:bCs w:val="0"/>
+              </w:rPr>
+            </w:pPr>
+          </w:p>
         </w:tc>
       </w:tr>
     </w:tbl>
     <w:p>
       <w:pPr>
-        <w:numPr>
-          <w:ilvl w:val="0"/>
-          <w:numId w:val="2"/>
-        </w:numPr>
-        <w:jc w:val="both"/>
-      </w:pPr>
+        <w:jc w:val="both"/>
+      </w:pPr>
+      <w:r>
+        <w:rPr>
+          <w:b/>
+        </w:rPr>
+        <w:t xml:space="preserve">  </w:t>
+      </w:r>
       <w:r>
         <w:rPr>
           <w:b/>
@@ -636,12 +565,14 @@
     </w:p>
     <w:p>
       <w:pPr>
-        <w:numPr>
-          <w:ilvl w:val="0"/>
-          <w:numId w:val="2"/>
-        </w:numPr>
-        <w:jc w:val="both"/>
-      </w:pPr>
+        <w:jc w:val="both"/>
+      </w:pPr>
+      <w:r>
+        <w:rPr>
+          <w:b/>
+        </w:rPr>
+        <w:t xml:space="preserve">  </w:t>
+      </w:r>
       <w:r>
         <w:rPr>
           <w:b/>
@@ -687,12 +618,14 @@
     </w:p>
     <w:p>
       <w:pPr>
-        <w:numPr>
-          <w:ilvl w:val="0"/>
-          <w:numId w:val="2"/>
-        </w:numPr>
-        <w:jc w:val="both"/>
-      </w:pPr>
+        <w:jc w:val="both"/>
+      </w:pPr>
+      <w:r>
+        <w:rPr>
+          <w:b/>
+        </w:rPr>
+        <w:t xml:space="preserve">  </w:t>
+      </w:r>
       <w:r>
         <w:rPr>
           <w:b/>
@@ -955,21 +888,21 @@
         <w:rPr>
           <w:b/>
         </w:rPr>
+        <w:t>Giao nhận:</w:t>
+      </w:r>
+      <w:r>
+        <w:t xml:space="preserve"> Bên B hỗ trợ bốc xếp lên phương tiện vận chuyển. Bên A có trách nhiệm cử đại diện kiểm đếm và ký Phiếu xuất kho/Biên bản bàn giao tại thời điểm nhận hàng.</w:t>
+      </w:r>
+    </w:p>
+    <w:p>
+      <w:pPr>
+        <w:jc w:val="both"/>
+      </w:pPr>
+      <w:r>
+        <w:rPr>
+          <w:b/>
+        </w:rPr>
         <w:lastRenderedPageBreak/>
-        <w:t>Giao nhận:</w:t>
-      </w:r>
-      <w:r>
-        <w:t xml:space="preserve"> Bên B hỗ trợ bốc xếp lên phương tiện vận chuyển. Bên A có trách nhiệm cử đại diện kiểm đếm và ký Phiếu xuất kho/Biên bản bàn giao tại thời điểm nhận hàng.</w:t>
-      </w:r>
-    </w:p>
-    <w:p>
-      <w:pPr>
-        <w:jc w:val="both"/>
-      </w:pPr>
-      <w:r>
-        <w:rPr>
-          <w:b/>
-        </w:rPr>
         <w:t>Điều 5: Điều khoản Thanh toán</w:t>
       </w:r>
     </w:p>
@@ -2046,6 +1979,232 @@
     </w:lvl>
   </w:abstractNum>
   <w:abstractNum w:abstractNumId="5" w15:restartNumberingAfterBreak="0">
+    <w:nsid w:val="2F4769E6"/>
+    <w:multiLevelType w:val="hybridMultilevel"/>
+    <w:tmpl w:val="DF02E912"/>
+    <w:lvl w:ilvl="0" w:tplc="04090001">
+      <w:start w:val="1"/>
+      <w:numFmt w:val="bullet"/>
+      <w:lvlText w:val=""/>
+      <w:lvlJc w:val="left"/>
+      <w:pPr>
+        <w:ind w:left="1080" w:hanging="360"/>
+      </w:pPr>
+      <w:rPr>
+        <w:rFonts w:ascii="Symbol" w:hAnsi="Symbol" w:hint="default"/>
+      </w:rPr>
+    </w:lvl>
+    <w:lvl w:ilvl="1" w:tplc="04090003" w:tentative="1">
+      <w:start w:val="1"/>
+      <w:numFmt w:val="bullet"/>
+      <w:lvlText w:val="o"/>
+      <w:lvlJc w:val="left"/>
+      <w:pPr>
+        <w:ind w:left="1800" w:hanging="360"/>
+      </w:pPr>
+      <w:rPr>
+        <w:rFonts w:ascii="Courier New" w:hAnsi="Courier New" w:cs="Courier New" w:hint="default"/>
+      </w:rPr>
+    </w:lvl>
+    <w:lvl w:ilvl="2" w:tplc="04090005" w:tentative="1">
+      <w:start w:val="1"/>
+      <w:numFmt w:val="bullet"/>
+      <w:lvlText w:val=""/>
+      <w:lvlJc w:val="left"/>
+      <w:pPr>
+        <w:ind w:left="2520" w:hanging="360"/>
+      </w:pPr>
+      <w:rPr>
+        <w:rFonts w:ascii="Wingdings" w:hAnsi="Wingdings" w:hint="default"/>
+      </w:rPr>
+    </w:lvl>
+    <w:lvl w:ilvl="3" w:tplc="04090001" w:tentative="1">
+      <w:start w:val="1"/>
+      <w:numFmt w:val="bullet"/>
+      <w:lvlText w:val=""/>
+      <w:lvlJc w:val="left"/>
+      <w:pPr>
+        <w:ind w:left="3240" w:hanging="360"/>
+      </w:pPr>
+      <w:rPr>
+        <w:rFonts w:ascii="Symbol" w:hAnsi="Symbol" w:hint="default"/>
+      </w:rPr>
+    </w:lvl>
+    <w:lvl w:ilvl="4" w:tplc="04090003" w:tentative="1">
+      <w:start w:val="1"/>
+      <w:numFmt w:val="bullet"/>
+      <w:lvlText w:val="o"/>
+      <w:lvlJc w:val="left"/>
+      <w:pPr>
+        <w:ind w:left="3960" w:hanging="360"/>
+      </w:pPr>
+      <w:rPr>
+        <w:rFonts w:ascii="Courier New" w:hAnsi="Courier New" w:cs="Courier New" w:hint="default"/>
+      </w:rPr>
+    </w:lvl>
+    <w:lvl w:ilvl="5" w:tplc="04090005" w:tentative="1">
+      <w:start w:val="1"/>
+      <w:numFmt w:val="bullet"/>
+      <w:lvlText w:val=""/>
+      <w:lvlJc w:val="left"/>
+      <w:pPr>
+        <w:ind w:left="4680" w:hanging="360"/>
+      </w:pPr>
+      <w:rPr>
+        <w:rFonts w:ascii="Wingdings" w:hAnsi="Wingdings" w:hint="default"/>
+      </w:rPr>
+    </w:lvl>
+    <w:lvl w:ilvl="6" w:tplc="04090001" w:tentative="1">
+      <w:start w:val="1"/>
+      <w:numFmt w:val="bullet"/>
+      <w:lvlText w:val=""/>
+      <w:lvlJc w:val="left"/>
+      <w:pPr>
+        <w:ind w:left="5400" w:hanging="360"/>
+      </w:pPr>
+      <w:rPr>
+        <w:rFonts w:ascii="Symbol" w:hAnsi="Symbol" w:hint="default"/>
+      </w:rPr>
+    </w:lvl>
+    <w:lvl w:ilvl="7" w:tplc="04090003" w:tentative="1">
+      <w:start w:val="1"/>
+      <w:numFmt w:val="bullet"/>
+      <w:lvlText w:val="o"/>
+      <w:lvlJc w:val="left"/>
+      <w:pPr>
+        <w:ind w:left="6120" w:hanging="360"/>
+      </w:pPr>
+      <w:rPr>
+        <w:rFonts w:ascii="Courier New" w:hAnsi="Courier New" w:cs="Courier New" w:hint="default"/>
+      </w:rPr>
+    </w:lvl>
+    <w:lvl w:ilvl="8" w:tplc="04090005" w:tentative="1">
+      <w:start w:val="1"/>
+      <w:numFmt w:val="bullet"/>
+      <w:lvlText w:val=""/>
+      <w:lvlJc w:val="left"/>
+      <w:pPr>
+        <w:ind w:left="6840" w:hanging="360"/>
+      </w:pPr>
+      <w:rPr>
+        <w:rFonts w:ascii="Wingdings" w:hAnsi="Wingdings" w:hint="default"/>
+      </w:rPr>
+    </w:lvl>
+  </w:abstractNum>
+  <w:abstractNum w:abstractNumId="6" w15:restartNumberingAfterBreak="0">
+    <w:nsid w:val="4ED33D05"/>
+    <w:multiLevelType w:val="hybridMultilevel"/>
+    <w:tmpl w:val="2CF07FEA"/>
+    <w:lvl w:ilvl="0" w:tplc="04090001">
+      <w:start w:val="1"/>
+      <w:numFmt w:val="bullet"/>
+      <w:lvlText w:val=""/>
+      <w:lvlJc w:val="left"/>
+      <w:pPr>
+        <w:ind w:left="720" w:hanging="360"/>
+      </w:pPr>
+      <w:rPr>
+        <w:rFonts w:ascii="Symbol" w:hAnsi="Symbol" w:hint="default"/>
+      </w:rPr>
+    </w:lvl>
+    <w:lvl w:ilvl="1" w:tplc="04090003" w:tentative="1">
+      <w:start w:val="1"/>
+      <w:numFmt w:val="bullet"/>
+      <w:lvlText w:val="o"/>
+      <w:lvlJc w:val="left"/>
+      <w:pPr>
+        <w:ind w:left="1440" w:hanging="360"/>
+      </w:pPr>
+      <w:rPr>
+        <w:rFonts w:ascii="Courier New" w:hAnsi="Courier New" w:cs="Courier New" w:hint="default"/>
+      </w:rPr>
+    </w:lvl>
+    <w:lvl w:ilvl="2" w:tplc="04090005" w:tentative="1">
+      <w:start w:val="1"/>
+      <w:numFmt w:val="bullet"/>
+      <w:lvlText w:val=""/>
+      <w:lvlJc w:val="left"/>
+      <w:pPr>
+        <w:ind w:left="2160" w:hanging="360"/>
+      </w:pPr>
+      <w:rPr>
+        <w:rFonts w:ascii="Wingdings" w:hAnsi="Wingdings" w:hint="default"/>
+      </w:rPr>
+    </w:lvl>
+    <w:lvl w:ilvl="3" w:tplc="04090001" w:tentative="1">
+      <w:start w:val="1"/>
+      <w:numFmt w:val="bullet"/>
+      <w:lvlText w:val=""/>
+      <w:lvlJc w:val="left"/>
+      <w:pPr>
+        <w:ind w:left="2880" w:hanging="360"/>
+      </w:pPr>
+      <w:rPr>
+        <w:rFonts w:ascii="Symbol" w:hAnsi="Symbol" w:hint="default"/>
+      </w:rPr>
+    </w:lvl>
+    <w:lvl w:ilvl="4" w:tplc="04090003" w:tentative="1">
+      <w:start w:val="1"/>
+      <w:numFmt w:val="bullet"/>
+      <w:lvlText w:val="o"/>
+      <w:lvlJc w:val="left"/>
+      <w:pPr>
+        <w:ind w:left="3600" w:hanging="360"/>
+      </w:pPr>
+      <w:rPr>
+        <w:rFonts w:ascii="Courier New" w:hAnsi="Courier New" w:cs="Courier New" w:hint="default"/>
+      </w:rPr>
+    </w:lvl>
+    <w:lvl w:ilvl="5" w:tplc="04090005" w:tentative="1">
+      <w:start w:val="1"/>
+      <w:numFmt w:val="bullet"/>
+      <w:lvlText w:val=""/>
+      <w:lvlJc w:val="left"/>
+      <w:pPr>
+        <w:ind w:left="4320" w:hanging="360"/>
+      </w:pPr>
+      <w:rPr>
+        <w:rFonts w:ascii="Wingdings" w:hAnsi="Wingdings" w:hint="default"/>
+      </w:rPr>
+    </w:lvl>
+    <w:lvl w:ilvl="6" w:tplc="04090001" w:tentative="1">
+      <w:start w:val="1"/>
+      <w:numFmt w:val="bullet"/>
+      <w:lvlText w:val=""/>
+      <w:lvlJc w:val="left"/>
+      <w:pPr>
+        <w:ind w:left="5040" w:hanging="360"/>
+      </w:pPr>
+      <w:rPr>
+        <w:rFonts w:ascii="Symbol" w:hAnsi="Symbol" w:hint="default"/>
+      </w:rPr>
+    </w:lvl>
+    <w:lvl w:ilvl="7" w:tplc="04090003" w:tentative="1">
+      <w:start w:val="1"/>
+      <w:numFmt w:val="bullet"/>
+      <w:lvlText w:val="o"/>
+      <w:lvlJc w:val="left"/>
+      <w:pPr>
+        <w:ind w:left="5760" w:hanging="360"/>
+      </w:pPr>
+      <w:rPr>
+        <w:rFonts w:ascii="Courier New" w:hAnsi="Courier New" w:cs="Courier New" w:hint="default"/>
+      </w:rPr>
+    </w:lvl>
+    <w:lvl w:ilvl="8" w:tplc="04090005" w:tentative="1">
+      <w:start w:val="1"/>
+      <w:numFmt w:val="bullet"/>
+      <w:lvlText w:val=""/>
+      <w:lvlJc w:val="left"/>
+      <w:pPr>
+        <w:ind w:left="6480" w:hanging="360"/>
+      </w:pPr>
+      <w:rPr>
+        <w:rFonts w:ascii="Wingdings" w:hAnsi="Wingdings" w:hint="default"/>
+      </w:rPr>
+    </w:lvl>
+  </w:abstractNum>
+  <w:abstractNum w:abstractNumId="7" w15:restartNumberingAfterBreak="0">
     <w:nsid w:val="66534A6B"/>
     <w:multiLevelType w:val="multilevel"/>
     <w:tmpl w:val="7DA6AE68"/>
@@ -2194,7 +2353,120 @@
       </w:rPr>
     </w:lvl>
   </w:abstractNum>
-  <w:abstractNum w:abstractNumId="6" w15:restartNumberingAfterBreak="0">
+  <w:abstractNum w:abstractNumId="8" w15:restartNumberingAfterBreak="0">
+    <w:nsid w:val="732B04EB"/>
+    <w:multiLevelType w:val="hybridMultilevel"/>
+    <w:tmpl w:val="BBC618B8"/>
+    <w:lvl w:ilvl="0" w:tplc="04090001">
+      <w:start w:val="1"/>
+      <w:numFmt w:val="bullet"/>
+      <w:lvlText w:val=""/>
+      <w:lvlJc w:val="left"/>
+      <w:pPr>
+        <w:ind w:left="720" w:hanging="360"/>
+      </w:pPr>
+      <w:rPr>
+        <w:rFonts w:ascii="Symbol" w:hAnsi="Symbol" w:hint="default"/>
+      </w:rPr>
+    </w:lvl>
+    <w:lvl w:ilvl="1" w:tplc="04090003" w:tentative="1">
+      <w:start w:val="1"/>
+      <w:numFmt w:val="bullet"/>
+      <w:lvlText w:val="o"/>
+      <w:lvlJc w:val="left"/>
+      <w:pPr>
+        <w:ind w:left="1440" w:hanging="360"/>
+      </w:pPr>
+      <w:rPr>
+        <w:rFonts w:ascii="Courier New" w:hAnsi="Courier New" w:cs="Courier New" w:hint="default"/>
+      </w:rPr>
+    </w:lvl>
+    <w:lvl w:ilvl="2" w:tplc="04090005" w:tentative="1">
+      <w:start w:val="1"/>
+      <w:numFmt w:val="bullet"/>
+      <w:lvlText w:val=""/>
+      <w:lvlJc w:val="left"/>
+      <w:pPr>
+        <w:ind w:left="2160" w:hanging="360"/>
+      </w:pPr>
+      <w:rPr>
+        <w:rFonts w:ascii="Wingdings" w:hAnsi="Wingdings" w:hint="default"/>
+      </w:rPr>
+    </w:lvl>
+    <w:lvl w:ilvl="3" w:tplc="04090001" w:tentative="1">
+      <w:start w:val="1"/>
+      <w:numFmt w:val="bullet"/>
+      <w:lvlText w:val=""/>
+      <w:lvlJc w:val="left"/>
+      <w:pPr>
+        <w:ind w:left="2880" w:hanging="360"/>
+      </w:pPr>
+      <w:rPr>
+        <w:rFonts w:ascii="Symbol" w:hAnsi="Symbol" w:hint="default"/>
+      </w:rPr>
+    </w:lvl>
+    <w:lvl w:ilvl="4" w:tplc="04090003" w:tentative="1">
+      <w:start w:val="1"/>
+      <w:numFmt w:val="bullet"/>
+      <w:lvlText w:val="o"/>
+      <w:lvlJc w:val="left"/>
+      <w:pPr>
+        <w:ind w:left="3600" w:hanging="360"/>
+      </w:pPr>
+      <w:rPr>
+        <w:rFonts w:ascii="Courier New" w:hAnsi="Courier New" w:cs="Courier New" w:hint="default"/>
+      </w:rPr>
+    </w:lvl>
+    <w:lvl w:ilvl="5" w:tplc="04090005" w:tentative="1">
+      <w:start w:val="1"/>
+      <w:numFmt w:val="bullet"/>
+      <w:lvlText w:val=""/>
+      <w:lvlJc w:val="left"/>
+      <w:pPr>
+        <w:ind w:left="4320" w:hanging="360"/>
+      </w:pPr>
+      <w:rPr>
+        <w:rFonts w:ascii="Wingdings" w:hAnsi="Wingdings" w:hint="default"/>
+      </w:rPr>
+    </w:lvl>
+    <w:lvl w:ilvl="6" w:tplc="04090001" w:tentative="1">
+      <w:start w:val="1"/>
+      <w:numFmt w:val="bullet"/>
+      <w:lvlText w:val=""/>
+      <w:lvlJc w:val="left"/>
+      <w:pPr>
+        <w:ind w:left="5040" w:hanging="360"/>
+      </w:pPr>
+      <w:rPr>
+        <w:rFonts w:ascii="Symbol" w:hAnsi="Symbol" w:hint="default"/>
+      </w:rPr>
+    </w:lvl>
+    <w:lvl w:ilvl="7" w:tplc="04090003" w:tentative="1">
+      <w:start w:val="1"/>
+      <w:numFmt w:val="bullet"/>
+      <w:lvlText w:val="o"/>
+      <w:lvlJc w:val="left"/>
+      <w:pPr>
+        <w:ind w:left="5760" w:hanging="360"/>
+      </w:pPr>
+      <w:rPr>
+        <w:rFonts w:ascii="Courier New" w:hAnsi="Courier New" w:cs="Courier New" w:hint="default"/>
+      </w:rPr>
+    </w:lvl>
+    <w:lvl w:ilvl="8" w:tplc="04090005" w:tentative="1">
+      <w:start w:val="1"/>
+      <w:numFmt w:val="bullet"/>
+      <w:lvlText w:val=""/>
+      <w:lvlJc w:val="left"/>
+      <w:pPr>
+        <w:ind w:left="6480" w:hanging="360"/>
+      </w:pPr>
+      <w:rPr>
+        <w:rFonts w:ascii="Wingdings" w:hAnsi="Wingdings" w:hint="default"/>
+      </w:rPr>
+    </w:lvl>
+  </w:abstractNum>
+  <w:abstractNum w:abstractNumId="9" w15:restartNumberingAfterBreak="0">
     <w:nsid w:val="78E706C3"/>
     <w:multiLevelType w:val="multilevel"/>
     <w:tmpl w:val="3A72769E"/>
@@ -2307,14 +2579,127 @@
       </w:pPr>
     </w:lvl>
   </w:abstractNum>
+  <w:abstractNum w:abstractNumId="10" w15:restartNumberingAfterBreak="0">
+    <w:nsid w:val="793373B3"/>
+    <w:multiLevelType w:val="hybridMultilevel"/>
+    <w:tmpl w:val="F3BCF8C4"/>
+    <w:lvl w:ilvl="0" w:tplc="04090001">
+      <w:start w:val="1"/>
+      <w:numFmt w:val="bullet"/>
+      <w:lvlText w:val=""/>
+      <w:lvlJc w:val="left"/>
+      <w:pPr>
+        <w:ind w:left="720" w:hanging="360"/>
+      </w:pPr>
+      <w:rPr>
+        <w:rFonts w:ascii="Symbol" w:hAnsi="Symbol" w:hint="default"/>
+      </w:rPr>
+    </w:lvl>
+    <w:lvl w:ilvl="1" w:tplc="04090003" w:tentative="1">
+      <w:start w:val="1"/>
+      <w:numFmt w:val="bullet"/>
+      <w:lvlText w:val="o"/>
+      <w:lvlJc w:val="left"/>
+      <w:pPr>
+        <w:ind w:left="1440" w:hanging="360"/>
+      </w:pPr>
+      <w:rPr>
+        <w:rFonts w:ascii="Courier New" w:hAnsi="Courier New" w:cs="Courier New" w:hint="default"/>
+      </w:rPr>
+    </w:lvl>
+    <w:lvl w:ilvl="2" w:tplc="04090005" w:tentative="1">
+      <w:start w:val="1"/>
+      <w:numFmt w:val="bullet"/>
+      <w:lvlText w:val=""/>
+      <w:lvlJc w:val="left"/>
+      <w:pPr>
+        <w:ind w:left="2160" w:hanging="360"/>
+      </w:pPr>
+      <w:rPr>
+        <w:rFonts w:ascii="Wingdings" w:hAnsi="Wingdings" w:hint="default"/>
+      </w:rPr>
+    </w:lvl>
+    <w:lvl w:ilvl="3" w:tplc="04090001" w:tentative="1">
+      <w:start w:val="1"/>
+      <w:numFmt w:val="bullet"/>
+      <w:lvlText w:val=""/>
+      <w:lvlJc w:val="left"/>
+      <w:pPr>
+        <w:ind w:left="2880" w:hanging="360"/>
+      </w:pPr>
+      <w:rPr>
+        <w:rFonts w:ascii="Symbol" w:hAnsi="Symbol" w:hint="default"/>
+      </w:rPr>
+    </w:lvl>
+    <w:lvl w:ilvl="4" w:tplc="04090003" w:tentative="1">
+      <w:start w:val="1"/>
+      <w:numFmt w:val="bullet"/>
+      <w:lvlText w:val="o"/>
+      <w:lvlJc w:val="left"/>
+      <w:pPr>
+        <w:ind w:left="3600" w:hanging="360"/>
+      </w:pPr>
+      <w:rPr>
+        <w:rFonts w:ascii="Courier New" w:hAnsi="Courier New" w:cs="Courier New" w:hint="default"/>
+      </w:rPr>
+    </w:lvl>
+    <w:lvl w:ilvl="5" w:tplc="04090005" w:tentative="1">
+      <w:start w:val="1"/>
+      <w:numFmt w:val="bullet"/>
+      <w:lvlText w:val=""/>
+      <w:lvlJc w:val="left"/>
+      <w:pPr>
+        <w:ind w:left="4320" w:hanging="360"/>
+      </w:pPr>
+      <w:rPr>
+        <w:rFonts w:ascii="Wingdings" w:hAnsi="Wingdings" w:hint="default"/>
+      </w:rPr>
+    </w:lvl>
+    <w:lvl w:ilvl="6" w:tplc="04090001" w:tentative="1">
+      <w:start w:val="1"/>
+      <w:numFmt w:val="bullet"/>
+      <w:lvlText w:val=""/>
+      <w:lvlJc w:val="left"/>
+      <w:pPr>
+        <w:ind w:left="5040" w:hanging="360"/>
+      </w:pPr>
+      <w:rPr>
+        <w:rFonts w:ascii="Symbol" w:hAnsi="Symbol" w:hint="default"/>
+      </w:rPr>
+    </w:lvl>
+    <w:lvl w:ilvl="7" w:tplc="04090003" w:tentative="1">
+      <w:start w:val="1"/>
+      <w:numFmt w:val="bullet"/>
+      <w:lvlText w:val="o"/>
+      <w:lvlJc w:val="left"/>
+      <w:pPr>
+        <w:ind w:left="5760" w:hanging="360"/>
+      </w:pPr>
+      <w:rPr>
+        <w:rFonts w:ascii="Courier New" w:hAnsi="Courier New" w:cs="Courier New" w:hint="default"/>
+      </w:rPr>
+    </w:lvl>
+    <w:lvl w:ilvl="8" w:tplc="04090005" w:tentative="1">
+      <w:start w:val="1"/>
+      <w:numFmt w:val="bullet"/>
+      <w:lvlText w:val=""/>
+      <w:lvlJc w:val="left"/>
+      <w:pPr>
+        <w:ind w:left="6480" w:hanging="360"/>
+      </w:pPr>
+      <w:rPr>
+        <w:rFonts w:ascii="Wingdings" w:hAnsi="Wingdings" w:hint="default"/>
+      </w:rPr>
+    </w:lvl>
+  </w:abstractNum>
   <w:num w:numId="1" w16cid:durableId="969357590">
-    <w:abstractNumId w:val="5"/>
+    <w:abstractNumId w:val="7"/>
   </w:num>
   <w:num w:numId="2" w16cid:durableId="1855001196">
     <w:abstractNumId w:val="0"/>
   </w:num>
   <w:num w:numId="3" w16cid:durableId="2111511260">
-    <w:abstractNumId w:val="6"/>
+    <w:abstractNumId w:val="9"/>
   </w:num>
   <w:num w:numId="4" w16cid:durableId="1675566805">
     <w:abstractNumId w:val="3"/>
@@ -2327,6 +2712,18 @@
   </w:num>
   <w:num w:numId="7" w16cid:durableId="795754170">
     <w:abstractNumId w:val="4"/>
+  </w:num>
+  <w:num w:numId="8" w16cid:durableId="464394059">
+    <w:abstractNumId w:val="6"/>
+  </w:num>
+  <w:num w:numId="9" w16cid:durableId="124465759">
+    <w:abstractNumId w:val="5"/>
+  </w:num>
+  <w:num w:numId="10" w16cid:durableId="633025115">
+    <w:abstractNumId w:val="10"/>
+  </w:num>
+  <w:num w:numId="11" w16cid:durableId="387152509">
+    <w:abstractNumId w:val="8"/>
   </w:num>
 </w:numbering>
 </file>
@@ -3312,6 +3709,25 @@
     <w:uiPriority w:val="99"/>
     <w:rsid w:val="00E87FA4"/>
   </w:style>
+  <w:style w:type="table" w:styleId="TableGrid">
+    <w:name w:val="Table Grid"/>
+    <w:basedOn w:val="TableNormal"/>
+    <w:uiPriority w:val="39"/>
+    <w:rsid w:val="0032153C"/>
+    <w:pPr>
+      <w:spacing w:after="0" w:line="240" w:lineRule="auto"/>
+    </w:pPr>
+    <w:tblPr>
+      <w:tblBorders>
+        <w:top w:val="single" w:sz="4" w:space="0" w:color="auto"/>
+        <w:left w:val="single" w:sz="4" w:space="0" w:color="auto"/>
+        <w:bottom w:val="single" w:sz="4" w:space="0" w:color="auto"/>
+        <w:right w:val="single" w:sz="4" w:space="0" w:color="auto"/>
+        <w:insideH w:val="single" w:sz="4" w:space="0" w:color="auto"/>
+        <w:insideV w:val="single" w:sz="4" w:space="0" w:color="auto"/>
+      </w:tblBorders>
+    </w:tblPr>
+  </w:style>
 </w:styles>
 </file>
 

</xml_diff>

<commit_message>
[UPDATE][PaymentService]: fix api generateReceipt from wword to pdf"
</commit_message>
<xml_diff>
--- a/AMMS.API/Templates/HopDongTemplate.docx
+++ b/AMMS.API/Templates/HopDongTemplate.docx
@@ -1208,7 +1208,7 @@
           </w:tcPr>
           <w:p>
             <w:pPr>
-              <w:jc w:val="both"/>
+              <w:jc w:val="center"/>
             </w:pPr>
             <w:r>
               <w:rPr>
@@ -1233,7 +1233,7 @@
           </w:tcPr>
           <w:p>
             <w:pPr>
-              <w:jc w:val="both"/>
+              <w:jc w:val="center"/>
             </w:pPr>
             <w:r>
               <w:rPr>

</xml_diff>

<commit_message>
[UPDATE][RequestService]: update save reciept docx to dataabase
</commit_message>
<xml_diff>
--- a/AMMS.API/Templates/HopDongTemplate.docx
+++ b/AMMS.API/Templates/HopDongTemplate.docx
@@ -1215,7 +1215,7 @@
                 <w:i/>
                 <w:iCs/>
               </w:rPr>
-              <w:t>(Ký, ghi rõ họ tên và đóng dấu)</w:t>
+              <w:t>(Ký, ghi rõ họ tên)</w:t>
             </w:r>
           </w:p>
         </w:tc>
@@ -1240,7 +1240,7 @@
                 <w:i/>
                 <w:iCs/>
               </w:rPr>
-              <w:t>(Ký, ghi rõ họ tên và đóng dấu)</w:t>
+              <w:t>(Ký, ghi rõ họ tên)</w:t>
             </w:r>
           </w:p>
         </w:tc>

</xml_diff>

<commit_message>
[UPDATE][EstimateService]: update logic check contract
</commit_message>
<xml_diff>
--- a/AMMS.API/Templates/HopDongTemplate.docx
+++ b/AMMS.API/Templates/HopDongTemplate.docx
@@ -1099,6 +1099,70 @@
         <w:jc w:val="both"/>
       </w:pPr>
       <w:r>
+        <w:rPr>
+          <w:noProof/>
+        </w:rPr>
+        <mc:AlternateContent>
+          <mc:Choice Requires="wpi">
+            <w:drawing>
+              <wp:anchor distT="0" distB="0" distL="114300" distR="114300" simplePos="0" relativeHeight="251659264" behindDoc="0" locked="0" layoutInCell="1" allowOverlap="1" wp14:anchorId="37889937" wp14:editId="23852AD6">
+                <wp:simplePos x="0" y="0"/>
+                <wp:positionH relativeFrom="column">
+                  <wp:posOffset>-2430900</wp:posOffset>
+                </wp:positionH>
+                <wp:positionV relativeFrom="paragraph">
+                  <wp:posOffset>273625</wp:posOffset>
+                </wp:positionV>
+                <wp:extent cx="360" cy="360"/>
+                <wp:effectExtent l="57150" t="57150" r="57150" b="57150"/>
+                <wp:wrapNone/>
+                <wp:docPr id="333579150" name="Ink 6"/>
+                <wp:cNvGraphicFramePr/>
+                <a:graphic xmlns:a="http://schemas.openxmlformats.org/drawingml/2006/main">
+                  <a:graphicData uri="http://schemas.microsoft.com/office/word/2010/wordprocessingInk">
+                    <w14:contentPart bwMode="auto" r:id="rId8">
+                      <w14:nvContentPartPr>
+                        <w14:cNvContentPartPr/>
+                      </w14:nvContentPartPr>
+                      <w14:xfrm>
+                        <a:off x="0" y="0"/>
+                        <a:ext cx="360" cy="360"/>
+                      </w14:xfrm>
+                    </w14:contentPart>
+                  </a:graphicData>
+                </a:graphic>
+              </wp:anchor>
+            </w:drawing>
+          </mc:Choice>
+          <mc:Fallback>
+            <w:pict>
+              <v:shapetype w14:anchorId="74A1155A" id="_x0000_t75" coordsize="21600,21600" o:spt="75" o:preferrelative="t" path="m@4@5l@4@11@9@11@9@5xe" filled="f" stroked="f">
+                <v:stroke joinstyle="miter"/>
+                <v:formulas>
+                  <v:f eqn="if lineDrawn pixelLineWidth 0"/>
+                  <v:f eqn="sum @0 1 0"/>
+                  <v:f eqn="sum 0 0 @1"/>
+                  <v:f eqn="prod @2 1 2"/>
+                  <v:f eqn="prod @3 21600 pixelWidth"/>
+                  <v:f eqn="prod @3 21600 pixelHeight"/>
+                  <v:f eqn="sum @0 0 1"/>
+                  <v:f eqn="prod @6 1 2"/>
+                  <v:f eqn="prod @7 21600 pixelWidth"/>
+                  <v:f eqn="sum @8 21600 0"/>
+                  <v:f eqn="prod @7 21600 pixelHeight"/>
+                  <v:f eqn="sum @10 21600 0"/>
+                </v:formulas>
+                <v:path o:extrusionok="f" gradientshapeok="t" o:connecttype="rect"/>
+                <o:lock v:ext="edit" aspectratio="t"/>
+              </v:shapetype>
+              <v:shape id="Ink 6" o:spid="_x0000_s1026" type="#_x0000_t75" style="position:absolute;margin-left:-192.1pt;margin-top:20.85pt;width:1.45pt;height:1.45pt;z-index:251659264;visibility:visible;mso-wrap-style:square;mso-wrap-distance-left:9pt;mso-wrap-distance-top:0;mso-wrap-distance-right:9pt;mso-wrap-distance-bottom:0;mso-position-horizontal:absolute;mso-position-horizontal-relative:text;mso-position-vertical:absolute;mso-position-vertical-relative:text" o:gfxdata="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">
+                <v:imagedata r:id="rId9" o:title=""/>
+              </v:shape>
+            </w:pict>
+          </mc:Fallback>
+        </mc:AlternateContent>
+      </w:r>
+      <w:r>
         <w:t>Hợp đồng có hiệu lực kể từ ngày ký.</w:t>
       </w:r>
     </w:p>
@@ -1247,7 +1311,7 @@
       </w:tr>
       <w:tr>
         <w:trPr>
-          <w:trHeight w:val="1674"/>
+          <w:trHeight w:val="2430"/>
           <w:tblCellSpacing w:w="15" w:type="dxa"/>
         </w:trPr>
         <w:tc>
@@ -1269,8 +1333,32 @@
             <w:r>
               <w:br/>
             </w:r>
+          </w:p>
+          <w:p>
+            <w:pPr>
+              <w:jc w:val="both"/>
+            </w:pPr>
+          </w:p>
+          <w:p>
+            <w:pPr>
+              <w:jc w:val="both"/>
+            </w:pPr>
+          </w:p>
+          <w:p>
+            <w:pPr>
+              <w:jc w:val="center"/>
+            </w:pPr>
             <w:r>
               <w:br/>
+            </w:r>
+            <w:r>
+              <w:t>{</w:t>
+            </w:r>
+            <w:r>
+              <w:t>{CUSTOMER_SIGN_NAME}</w:t>
+            </w:r>
+            <w:r>
+              <w:t>}</w:t>
             </w:r>
             <w:r>
               <w:br/>
@@ -1291,8 +1379,59 @@
           </w:tcPr>
           <w:p>
             <w:pPr>
-              <w:jc w:val="both"/>
+              <w:jc w:val="center"/>
             </w:pPr>
+            <w:r>
+              <w:rPr>
+                <w:noProof/>
+              </w:rPr>
+              <mc:AlternateContent>
+                <mc:Choice Requires="wpi">
+                  <w:drawing>
+                    <wp:anchor distT="0" distB="0" distL="114300" distR="114300" simplePos="0" relativeHeight="251660288" behindDoc="0" locked="0" layoutInCell="1" allowOverlap="1" wp14:anchorId="1C92D545" wp14:editId="7E7BD91F">
+                      <wp:simplePos x="0" y="0"/>
+                      <wp:positionH relativeFrom="column">
+                        <wp:posOffset>355600</wp:posOffset>
+                      </wp:positionH>
+                      <wp:positionV relativeFrom="paragraph">
+                        <wp:posOffset>262255</wp:posOffset>
+                      </wp:positionV>
+                      <wp:extent cx="1732915" cy="669290"/>
+                      <wp:effectExtent l="57150" t="57150" r="635" b="54610"/>
+                      <wp:wrapNone/>
+                      <wp:docPr id="852975553" name="Ink 12"/>
+                      <wp:cNvGraphicFramePr/>
+                      <a:graphic xmlns:a="http://schemas.openxmlformats.org/drawingml/2006/main">
+                        <a:graphicData uri="http://schemas.microsoft.com/office/word/2010/wordprocessingInk">
+                          <w14:contentPart bwMode="auto" r:id="rId10">
+                            <w14:nvContentPartPr>
+                              <w14:cNvContentPartPr/>
+                            </w14:nvContentPartPr>
+                            <w14:xfrm>
+                              <a:off x="0" y="0"/>
+                              <a:ext cx="1732915" cy="669290"/>
+                            </w14:xfrm>
+                          </w14:contentPart>
+                        </a:graphicData>
+                      </a:graphic>
+                      <wp14:sizeRelH relativeFrom="margin">
+                        <wp14:pctWidth>0</wp14:pctWidth>
+                      </wp14:sizeRelH>
+                      <wp14:sizeRelV relativeFrom="margin">
+                        <wp14:pctHeight>0</wp14:pctHeight>
+                      </wp14:sizeRelV>
+                    </wp:anchor>
+                  </w:drawing>
+                </mc:Choice>
+                <mc:Fallback>
+                  <w:pict>
+                    <v:shape w14:anchorId="47CFFE76" id="Ink 12" o:spid="_x0000_s1026" type="#_x0000_t75" style="position:absolute;margin-left:27.3pt;margin-top:19.95pt;width:137.85pt;height:54.1pt;z-index:251660288;visibility:visible;mso-wrap-style:square;mso-width-percent:0;mso-height-percent:0;mso-wrap-distance-left:9pt;mso-wrap-distance-top:0;mso-wrap-distance-right:9pt;mso-wrap-distance-bottom:0;mso-position-horizontal:absolute;mso-position-horizontal-relative:text;mso-position-vertical:absolute;mso-position-vertical-relative:text;mso-width-percent:0;mso-height-percent:0;mso-width-relative:margin;mso-height-relative:margin" o:gfxdata="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">
+                      <v:imagedata r:id="rId11" o:title=""/>
+                    </v:shape>
+                  </w:pict>
+                </mc:Fallback>
+              </mc:AlternateContent>
+            </w:r>
             <w:r>
               <w:br/>
             </w:r>
@@ -1301,6 +1440,19 @@
             </w:r>
             <w:r>
               <w:br/>
+            </w:r>
+          </w:p>
+          <w:p>
+            <w:pPr>
+              <w:jc w:val="center"/>
+            </w:pPr>
+          </w:p>
+          <w:p>
+            <w:pPr>
+              <w:jc w:val="center"/>
+            </w:pPr>
+            <w:r>
+              <w:t>Phan Thanh Phong</w:t>
             </w:r>
           </w:p>
         </w:tc>
@@ -3333,7 +3485,6 @@
   <w:style w:type="character" w:default="1" w:styleId="DefaultParagraphFont">
     <w:name w:val="Default Paragraph Font"/>
     <w:uiPriority w:val="1"/>
-    <w:semiHidden/>
     <w:unhideWhenUsed/>
   </w:style>
   <w:style w:type="table" w:default="1" w:styleId="TableNormal">
@@ -3731,6 +3882,60 @@
 </w:styles>
 </file>
 
+<file path=word/ink/ink1.xml><?xml version="1.0" encoding="utf-8"?>
+<inkml:ink xmlns:inkml="http://www.w3.org/2003/InkML">
+  <inkml:definitions>
+    <inkml:context xml:id="ctx0">
+      <inkml:inkSource xml:id="inkSrc0">
+        <inkml:traceFormat>
+          <inkml:channel name="X" type="integer" min="-2.14748E9" max="2.14748E9" units="cm"/>
+          <inkml:channel name="Y" type="integer" min="-2.14748E9" max="2.14748E9" units="cm"/>
+          <inkml:channel name="F" type="integer" max="32767" units="dev"/>
+        </inkml:traceFormat>
+        <inkml:channelProperties>
+          <inkml:channelProperty channel="X" name="resolution" value="1000" units="1/cm"/>
+          <inkml:channelProperty channel="Y" name="resolution" value="1000" units="1/cm"/>
+          <inkml:channelProperty channel="F" name="resolution" value="0" units="1/dev"/>
+        </inkml:channelProperties>
+      </inkml:inkSource>
+      <inkml:timestamp xml:id="ts0" timeString="2026-04-20T02:53:13.636"/>
+    </inkml:context>
+    <inkml:brush xml:id="br0">
+      <inkml:brushProperty name="width" value="0.05" units="cm"/>
+      <inkml:brushProperty name="height" value="0.05" units="cm"/>
+    </inkml:brush>
+  </inkml:definitions>
+  <inkml:trace contextRef="#ctx0" brushRef="#br0">0 0 24575</inkml:trace>
+</inkml:ink>
+</file>
+
+<file path=word/ink/ink2.xml><?xml version="1.0" encoding="utf-8"?>
+<inkml:ink xmlns:inkml="http://www.w3.org/2003/InkML">
+  <inkml:definitions>
+    <inkml:context xml:id="ctx0">
+      <inkml:inkSource xml:id="inkSrc0">
+        <inkml:traceFormat>
+          <inkml:channel name="X" type="integer" min="-2.14748E9" max="2.14748E9" units="cm"/>
+          <inkml:channel name="Y" type="integer" min="-2.14748E9" max="2.14748E9" units="cm"/>
+          <inkml:channel name="F" type="integer" max="32767" units="dev"/>
+        </inkml:traceFormat>
+        <inkml:channelProperties>
+          <inkml:channelProperty channel="X" name="resolution" value="1000" units="1/cm"/>
+          <inkml:channelProperty channel="Y" name="resolution" value="1000" units="1/cm"/>
+          <inkml:channelProperty channel="F" name="resolution" value="0" units="1/dev"/>
+        </inkml:channelProperties>
+      </inkml:inkSource>
+      <inkml:timestamp xml:id="ts0" timeString="2026-04-20T02:53:46.522"/>
+    </inkml:context>
+    <inkml:brush xml:id="br0">
+      <inkml:brushProperty name="width" value="0.05" units="cm"/>
+      <inkml:brushProperty name="height" value="0.05" units="cm"/>
+    </inkml:brush>
+  </inkml:definitions>
+  <inkml:trace contextRef="#ctx0" brushRef="#br0">0 234 24575,'43'-13'0,"-1"-1"0,50-25 0,58-21 0,-61 35-11,2 5 0,156-15 0,195 11-810,-410 23 702,42-1 28,677 4-352,-717 1 425,0 0 0,0 3 0,56 15 0,-81-18 18,0 0 1,0 1-1,0 0 0,-1 0 0,0 1 0,0 0 1,0 0-1,-1 1 0,0 0 0,0 0 0,0 1 1,-1 0-1,0 0 0,0 1 0,0-1 1,-1 1-1,7 16 0,-8-13-1,0 0 1,-1 0-1,0 0 1,-1 1-1,0-1 0,-1 1 1,0 16-1,-2-1 66,-2 1 0,-6 31 1,-6 8 186,-44 122-1,-50 60-5095,82-196 4623,-2-1 1,-2-1-1,-3-2 1,-1-1-1,-64 66 1,70-86 249,-2 0 0,-1-2 1,-1-2-1,-1-1 1,-1-1-1,0-2 0,-2-2 1,-73 26-1,70-31 466,0-3 0,0-1-1,-67 6 1,87-14-128,0 0 1,-1-1-1,1-1 1,0-1-1,0-1 1,0-1-1,0-1 1,0 0-1,-23-10 1,37 12-321,1 0 0,0 0 0,-1 0 1,1 0-1,0-1 0,1 0 1,-1 0-1,1 0 0,-1-1 1,1 1-1,1-1 0,-1 0 1,1 0-1,0 0 0,0-1 0,0 1 1,1-1-1,-1 0 0,1 0 1,1 1-1,-1-1 0,1 0 1,0-1-1,1 1 0,-1-9 0,2 4-54,0 0 0,0 0 0,1 0 0,1 0 0,0 1 0,0-1 0,1 1 0,0-1 0,1 1 0,0 0 0,1 1-1,0-1 1,12-13 0,2 0 7,2 1 0,0 1 0,32-22 0,91-54 0,290-140-927,22 24 487,205-104 116,-658 315 320,34-18-9,0-1 1,-1-2-1,41-34 0,-64 41 13,-14 16 0,0 0 0,0 0 0,0 0 0,0-1 0,0 1 0,0 0 0,0 0 0,0 0 0,0 0 0,0-1 0,0 1 0,0 0 0,0 0 0,0 0 0,0 0 0,0-1 0,0 1 0,0 0 0,-1 0 0,1 0 0,0 0 0,0 0 0,0 0 0,0-1 0,0 1 0,0 0 0,0 0 0,-1 0 0,1 0 0,0 0 0,0 0 0,0 0 0,0 0 0,0 0 0,-1-1 0,1 1 0,0 0 0,0 0 0,0 0 0,0 0 0,0 0 0,-1 0 0,1 0 0,0 0 0,0 0 0,0 0 0,0 0 0,-1 0 0,1 1 0,-34 7 0,-21 11 88,0 3 0,1 3 0,1 2 0,2 2 0,1 2 0,-54 44 0,103-74-118,-5 4-844,-1 1 0,1 0 0,0 1 0,-8 9 1,14-15 847,-1 0 0,0-1 1,1 1-1,-1 0 1,1 0-1,-1 0 0,1 0 1,-1 0-1,1 0 1,0 0-1,-1 0 0,1 0 1,0 0-1,0 0 1,0 0-1,0 0 0,0 0 1,0 0-1,0 0 1,0 0-1,0 0 0,0 0 1,0 0-1,1 0 1,-1 0-1,0 0 0,1-1 1,-1 1-1,1 0 1,-1 0-1,1 0 0,-1 0 1,1 0-1,0-1 1,-1 1-1,1 0 0,0-1 1,0 1-1,0 0 1,-1-1-1,1 1 0,0-1 1,0 1-1,0-1 1,0 1-1,0-1 0,0 0 1,2 1-1,15 3 26,-1-1 0,1-1 0,0 0 0,1-1 0,-1-1 0,0-1 0,25-4 0,0 1 0,33-4-52,9-2 1143,-29 12 3524,-54-2-4569,1 0 0,-1 0 0,1 1 0,-1-1 1,1 1-1,-1 0 0,1-1 0,-1 1 0,0 0 0,1 0 1,-1 1-1,0-1 0,0 0 0,0 1 0,0-1 1,0 1-1,0 0 0,0 0 0,0 0 0,-1 0 1,1 0-1,-1 0 0,0 0 0,3 4 0,-2 1-44,-1 1-1,0-1 1,0 0 0,0 0-1,-1 0 1,0 1-1,-1 6 1,0-9-5,1 1 1,-1-1-1,1 0 0,0 1 1,1-1-1,-1 0 1,1 1-1,0-1 0,0 0 1,1 0-1,0 0 0,0 0 1,4 9-1,-4-13 3,-1 1 0,1-1 0,0 0 0,-1 0 0,1 0 0,0 0 0,0 0 0,0 0 0,0 0 0,0 0 0,0-1 0,0 1 0,0-1 0,0 1 0,0-1 0,0 0 0,0 0 0,0 0 0,0 0 0,0 0 0,1-1 0,1 0 0,47-14 0,-25 4-910,-1-2 0,0 0 0,-1-2-1,0 0 1,-1-2 0,32-31 0,-27 21 827,-1-1 1,-2-1-1,-1-1 1,25-43-1,-26 36 83,-23 36-1,0 1 0,0-1 0,0 1 0,0-1-1,1 1 1,-1-1 0,0 1 0,0 0 0,1-1 0,-1 1 0,0-1-1,1 1 1,-1-1 0,0 1 0,1 0 0,-1-1 0,1 1-1,-1 0 1,1 0 0,-1-1 0,1 1 0,-1 0 0,0 0 0,1-1-1,-1 1 1,1 0 0,0 0 0,-1 0 0,1 0 0,-1 18 1166,-18 78 4079,-29 205-4835,45-278-409,0-8 0,1 0 0,0 0 0,1 0 0,0 0 0,4 20 0,-4-33 0,0-1 0,1 0 0,-1 1 0,0-1 0,0 1 0,1-1 0,-1 0 0,1 0 0,-1 1 0,1-1 0,0 0 0,-1 0 0,1 0 0,0 0 0,0 1 0,0-1 0,0 0 0,0-1 0,0 1 0,0 0 0,0 0 0,0 0 0,0-1 0,1 1 0,-1 0 0,0-1 0,0 1 0,1-1 0,-1 0 0,0 1 0,1-1 0,-1 0 0,0 0 0,1 0 0,-1 0 0,1 0 0,-1 0 0,0 0 0,1 0 0,-1 0 0,0-1 0,1 1 0,0-1 0,4-2 0,0 0 0,0 0 0,-1-1 0,1 1 0,-1-1 0,0 0 0,0-1 0,5-5 0,11-15-340,0-1 0,-2-1 0,18-32 0,41-91-4716,-63 118 4688,12-13 368,-27 44-21,0 1 0,0 0-1,0-1 1,1 1-1,-1 0 1,0-1 0,0 1-1,0 0 1,0-1-1,1 1 1,-1 0 0,0-1-1,0 1 1,1 0 0,-1 0-1,0-1 1,0 1-1,1 0 1,-1 0 0,0 0-1,1 0 1,-1-1 0,0 1-1,1 0 1,-1 0-1,0 0 1,1 0 0,-1 0-1,1 0 1,-1 0 0,0 0-1,1 0 1,-1 0-1,0 0 1,1 0 0,-1 0-1,0 0 1,1 0 0,-1 0-1,0 0 1,1 1-1,-1-1 1,0 0 0,1 0-1,-1 0 1,0 1-1,1-1 1,-1 0 0,0 0-1,0 1 1,1-1 0,-1 0-1,0 0 1,0 1-1,0-1 1,1 0 0,-1 1-1,0-1 1,0 0 0,0 1-1,0-1 1,0 0-1,0 1 1,0-1 0,0 0-1,0 1 1,0-1 0,0 1-1,1 29-2283,-16 113 1447,7-90 2404,3 1 0,2 98 0,3-149-1525,1 1 0,-1 0 0,1 0-1,0 0 1,0-1 0,0 1 0,0 0-1,1-1 1,-1 0 0,1 1 0,0-1-1,0 0 1,0 1 0,1-1-1,-1-1 1,4 5 0,-3-6 220,-1 1 0,1-1 0,-1 1 0,1-1 0,0 0 0,-1 0 0,1 0-1,0 0 1,0 0 0,0-1 0,0 0 0,-1 1 0,1-1 0,0 0 0,0 0 0,0 0 0,0-1 0,0 1 0,0-1 0,0 0 0,5-2 0,2-1-154,0-1 1,0-1 0,0 1 0,-1-2 0,1 1 0,-1-1-1,-1-1 1,0 0 0,0 0 0,0 0 0,-1-1 0,0 0 0,8-15-1,0-3-111,-1 0-1,0-1 0,15-52 0,-19 46 25,-1 0 0,8-58 0,-17 85 0,1 1 0,-1 0 0,0 0 0,-1-1 0,-1-6 0,2 13 0,1 0 0,-1-1 0,0 1 0,0 0 0,0 0 0,0-1 0,0 1 0,0 0 0,0-1 0,0 1 0,0 0 0,-1 0 0,1-1 0,0 1 0,0 0 0,0-1 0,0 1 0,0 0 0,0 0 0,-1-1 0,1 1 0,0 0 0,0 0 0,0 0 0,0-1 0,-1 1 0,1 0 0,0 0 0,0 0 0,-1 0 0,1-1 0,0 1 0,0 0 0,-1 0 0,1 0 0,0 0 0,0 0 0,-1 0 0,1 0 0,0 0 0,-1 0 0,1 0 0,0 0 0,0 0 0,-1 0 0,1 0 0,0 0 0,-1 0 0,1 0 0,0 0 0,0 0 0,-1 0 0,1 0 0,0 1 0,0-1 0,-1 0 0,1 0 0,0 0 0,0 0 0,-1 1 0,-3 6 0,0 0 0,1 0 0,0 1 0,0 0 0,1-1 0,0 1 0,0 0 0,0 0 0,1 10 0,-2-4 0,-8 57-3396,-3 81-1,14-123 3402,3 35-1,6-32-39,-9-31 40,1 0 0,-1 0-1,1 0 1,-1 0-1,1 0 1,0-1-1,-1 1 1,1 0-1,0-1 1,0 1 0,-1 0-1,1-1 1,0 1-1,0-1 1,0 1-1,0-1 1,0 1-1,2-1 1,-1 0-42,0 0 1,1-1-1,-1 1 0,1-1 0,-1 0 1,0 1-1,1-1 0,-1-1 1,0 1-1,0 0 0,0 0 0,0-1 1,0 1-1,0-1 0,0 0 0,-1 1 1,1-1-1,0 0 0,-1 0 1,1 0-1,0-3 0,10-11-997,-1-1 0,14-27 0,-11 14 1553,-2 0 0,12-46 0,-10 18 248,-3 0 0,3-62 0,-12 105-767,-1 1 0,0-1 0,-1 0 0,-1 1 0,0-1 0,-5-21 0,6 35 77,0 0-1,0 0 0,0 1 1,0-1-1,-1 0 0,1 0 1,0 1-1,0-1 0,-1 0 0,1 1 1,0-1-1,-1 0 0,1 1 1,0-1-1,-1 0 0,1 1 1,-1-1-1,1 1 0,-1-1 1,0 1-1,1-1 0,-1 1 1,1-1-1,-1 1 0,0 0 1,1-1-1,-1 1 0,0 0 1,0 0-1,1-1 0,-1 1 1,0 0-1,0 0 0,1 0 0,-1 0 1,0 0-1,0 0 0,1 0 1,-1 0-1,0 0 0,0 0 1,1 1-1,-1-1 0,0 0 1,1 0-1,-1 1 0,0-1 1,1 0-1,-1 1 0,0-1 1,1 1-1,-1-1 0,1 1 1,-1-1-1,0 1 0,1-1 0,0 1 1,-1 0-1,0 0 0,-3 4 292,0 1-1,0-1 1,0 1-1,1 0 1,-4 8-1,0 3-367,1 1 0,2 0 0,-1 0 0,2 1 0,1-1 0,0 1 0,1-1 0,1 1 0,1-1 0,0 1 0,1 0 0,7 24 0,-8-39 0,0 0 0,1 0 0,-1 0 0,1 0 0,-1-1 0,1 1 0,1-1 0,-1 1 0,0-1 0,1 0 0,-1 0 0,1 0 0,0 0 0,0 0 0,0 0 0,1-1 0,4 3 0,-6-4 0,0 0 0,0-1 0,0 1 0,1-1 0,-1 0 0,0 0 0,0 0 0,0 0 0,1 0 0,-1 0 0,0 0 0,0-1 0,0 1 0,0-1 0,0 0 0,1 1 0,-1-1 0,0 0 0,-1 0 0,1 0 0,0-1 0,0 1 0,0 0 0,-1-1 0,1 1 0,-1-1 0,1 1 0,-1-1 0,1 0 0,-1 0 0,0 0 0,1-2 0,3-3 0,-1 0 0,-1 0 0,0 0 0,0-1 0,0 1 0,-1-1 0,2-9 0,-4 8 0,-3 10 0,-9 15 0,-108 221 0,50-90 0,23-56 0,-4-2 0,-104 140 0,121-188 0,-2-1 0,-1-1 0,-2-2 0,-1-2 0,-2-2 0,-1-2 0,-53 30 0,31-29 0,0-3 0,-2-3 0,-1-2 0,0-4 0,-92 16 0,-10-11 0,-179 5 0,-293-24-1033,478-15 793,-302-57 0,366 42 224,-144-54 1,201 59 15,43 18 5,-1 1-1,1 0 0,0 0 0,-1-1 0,1 1 0,0 0 1,0 0-1,-1-1 0,1 1 0,0-1 0,0 1 0,0 0 1,-1-1-1,1 1 0,0 0 0,0-1 0,0 1 0,0-1 1,0 1-1,0 0 0,0-1 0,0 1 0,0-1 0,0 1 1,0 0-1,0-1 0,0 1 0,0-1 0,0 1 0,0 0 1,0-1-1,1 1 0,-1-1 0,0 1 0,0 0 0,0-1 1,1 1-1,-1 0 0,0-1 0,0 1 0,1 0 0,-1 0 1,0-1-1,1 1 0,-1 0 0,0 0 0,1-1 1,-1 1-1,0 0 0,1 0 0,-1 0 0,1 0 0,0-1 1,14-8 175,1 1 1,0 0-1,1 1 1,0 1-1,32-8 1,17-5-244,169-55-358,98-32-134,-37 11-1152,1166-367 1083,-834 275-3975,-555 166 4026,141-37 159,-173 50 447,1 1-1,0 2 0,45 0 1,73 19 1928,-86-6 2643,-46-5-10299</inkml:trace>
+</inkml:ink>
+</file>
+
 <file path=word/theme/theme1.xml><?xml version="1.0" encoding="utf-8"?>
 <a:theme xmlns:a="http://schemas.openxmlformats.org/drawingml/2006/main" name="Office Theme">
   <a:themeElements>
@@ -4024,4 +4229,16 @@
     </a:ext>
   </a:extLst>
 </a:theme>
+</file>
+
+<file path=customXml/item1.xml><?xml version="1.0" encoding="utf-8"?>
+<b:Sources xmlns:b="http://schemas.openxmlformats.org/officeDocument/2006/bibliography" xmlns="http://schemas.openxmlformats.org/officeDocument/2006/bibliography" SelectedStyle="\APASixthEditionOfficeOnline.xsl" StyleName="APA" Version="6"/>
+</file>
+
+<file path=customXml/itemProps1.xml><?xml version="1.0" encoding="utf-8"?>
+<ds:datastoreItem xmlns:ds="http://schemas.openxmlformats.org/officeDocument/2006/customXml" ds:itemID="{38D8A863-A29B-419D-80D5-AA900A6D8430}">
+  <ds:schemaRefs>
+    <ds:schemaRef ds:uri="http://schemas.openxmlformats.org/officeDocument/2006/bibliography"/>
+  </ds:schemaRefs>
+</ds:datastoreItem>
 </file>
</xml_diff>